<commit_message>
Tesztelési dokumnetáció befejezve és trailer mezős hiba kijavítva + képek
</commit_message>
<xml_diff>
--- a/doc/tesztelesi_dokumnetacio.docx
+++ b/doc/tesztelesi_dokumnetacio.docx
@@ -8,283 +8,1828 @@
         <w:rPr>
           <w:rFonts w:ascii="Times New Roman" w:hAnsi="Times New Roman" w:cs="Times New Roman"/>
           <w:b/>
+          <w:sz w:val="52"/>
+          <w:szCs w:val="52"/>
+        </w:rPr>
+      </w:pPr>
+      <w:bookmarkStart w:id="0" w:name="_GoBack"/>
+      <w:bookmarkEnd w:id="0"/>
+      <w:r>
+        <w:rPr>
+          <w:rFonts w:ascii="Times New Roman" w:hAnsi="Times New Roman" w:cs="Times New Roman"/>
+          <w:b/>
+          <w:sz w:val="52"/>
+          <w:szCs w:val="52"/>
+        </w:rPr>
+        <w:t>CosmoScreen tesztelési dokumentáció</w:t>
+      </w:r>
+    </w:p>
+    <w:p>
+      <w:pPr>
+        <w:spacing w:before="100" w:beforeAutospacing="1" w:after="100" w:afterAutospacing="1" w:line="240" w:lineRule="auto"/>
+        <w:outlineLvl w:val="1"/>
+        <w:rPr>
+          <w:rFonts w:ascii="Times New Roman" w:eastAsia="Times New Roman" w:hAnsi="Times New Roman" w:cs="Times New Roman"/>
+          <w:bCs/>
+          <w:sz w:val="44"/>
+          <w:szCs w:val="44"/>
+          <w:lang w:eastAsia="hu-HU"/>
+        </w:rPr>
+      </w:pPr>
+      <w:r>
+        <w:rPr>
+          <w:rFonts w:ascii="Times New Roman" w:eastAsia="Times New Roman" w:hAnsi="Times New Roman" w:cs="Times New Roman"/>
+          <w:bCs/>
+          <w:sz w:val="44"/>
+          <w:szCs w:val="44"/>
+          <w:lang w:eastAsia="hu-HU"/>
+        </w:rPr>
+        <w:t>1. Alapadatok</w:t>
+      </w:r>
+    </w:p>
+    <w:p>
+      <w:pPr>
+        <w:spacing w:before="100" w:beforeAutospacing="1" w:after="100" w:afterAutospacing="1" w:line="240" w:lineRule="auto"/>
+        <w:rPr>
+          <w:rFonts w:ascii="Times New Roman" w:eastAsia="Times New Roman" w:hAnsi="Times New Roman" w:cs="Times New Roman"/>
+          <w:sz w:val="36"/>
+          <w:szCs w:val="36"/>
+          <w:lang w:eastAsia="hu-HU"/>
+        </w:rPr>
+      </w:pPr>
+      <w:r>
+        <w:rPr>
+          <w:rFonts w:ascii="Times New Roman" w:eastAsia="Times New Roman" w:hAnsi="Times New Roman" w:cs="Times New Roman"/>
+          <w:b/>
+          <w:bCs/>
+          <w:sz w:val="36"/>
+          <w:szCs w:val="36"/>
+          <w:lang w:eastAsia="hu-HU"/>
+        </w:rPr>
+        <w:t>Projekt neve:</w:t>
+      </w:r>
+      <w:r>
+        <w:rPr>
+          <w:rFonts w:ascii="Times New Roman" w:eastAsia="Times New Roman" w:hAnsi="Times New Roman" w:cs="Times New Roman"/>
+          <w:sz w:val="36"/>
+          <w:szCs w:val="36"/>
+          <w:lang w:eastAsia="hu-HU"/>
+        </w:rPr>
+        <w:t xml:space="preserve"> CosmoScreen</w:t>
+      </w:r>
+      <w:r>
+        <w:rPr>
+          <w:rFonts w:ascii="Times New Roman" w:eastAsia="Times New Roman" w:hAnsi="Times New Roman" w:cs="Times New Roman"/>
+          <w:sz w:val="36"/>
+          <w:szCs w:val="36"/>
+          <w:lang w:eastAsia="hu-HU"/>
+        </w:rPr>
+        <w:br/>
+      </w:r>
+      <w:r>
+        <w:rPr>
+          <w:rFonts w:ascii="Times New Roman" w:eastAsia="Times New Roman" w:hAnsi="Times New Roman" w:cs="Times New Roman"/>
+          <w:b/>
+          <w:bCs/>
+          <w:sz w:val="36"/>
+          <w:szCs w:val="36"/>
+          <w:lang w:eastAsia="hu-HU"/>
+        </w:rPr>
+        <w:t>Alkalmazás típusa:</w:t>
+      </w:r>
+      <w:r>
+        <w:rPr>
+          <w:rFonts w:ascii="Times New Roman" w:eastAsia="Times New Roman" w:hAnsi="Times New Roman" w:cs="Times New Roman"/>
+          <w:sz w:val="36"/>
+          <w:szCs w:val="36"/>
+          <w:lang w:eastAsia="hu-HU"/>
+        </w:rPr>
+        <w:t xml:space="preserve"> WPF desktop alkalmazás</w:t>
+      </w:r>
+      <w:r>
+        <w:rPr>
+          <w:rFonts w:ascii="Times New Roman" w:eastAsia="Times New Roman" w:hAnsi="Times New Roman" w:cs="Times New Roman"/>
+          <w:sz w:val="36"/>
+          <w:szCs w:val="36"/>
+          <w:lang w:eastAsia="hu-HU"/>
+        </w:rPr>
+        <w:br/>
+      </w:r>
+      <w:r>
+        <w:rPr>
+          <w:rFonts w:ascii="Times New Roman" w:eastAsia="Times New Roman" w:hAnsi="Times New Roman" w:cs="Times New Roman"/>
+          <w:b/>
+          <w:bCs/>
+          <w:sz w:val="36"/>
+          <w:szCs w:val="36"/>
+          <w:lang w:eastAsia="hu-HU"/>
+        </w:rPr>
+        <w:t>Tesztelő:</w:t>
+      </w:r>
+      <w:r>
+        <w:rPr>
+          <w:rFonts w:ascii="Times New Roman" w:eastAsia="Times New Roman" w:hAnsi="Times New Roman" w:cs="Times New Roman"/>
+          <w:sz w:val="36"/>
+          <w:szCs w:val="36"/>
+          <w:lang w:eastAsia="hu-HU"/>
+        </w:rPr>
+        <w:t xml:space="preserve"> Kriván Balázs, Fodor Adrián László</w:t>
+      </w:r>
+      <w:r>
+        <w:rPr>
+          <w:rFonts w:ascii="Times New Roman" w:eastAsia="Times New Roman" w:hAnsi="Times New Roman" w:cs="Times New Roman"/>
+          <w:sz w:val="36"/>
+          <w:szCs w:val="36"/>
+          <w:lang w:eastAsia="hu-HU"/>
+        </w:rPr>
+        <w:br/>
+      </w:r>
+      <w:r>
+        <w:rPr>
+          <w:rFonts w:ascii="Times New Roman" w:eastAsia="Times New Roman" w:hAnsi="Times New Roman" w:cs="Times New Roman"/>
+          <w:b/>
+          <w:bCs/>
+          <w:sz w:val="36"/>
+          <w:szCs w:val="36"/>
+          <w:lang w:eastAsia="hu-HU"/>
+        </w:rPr>
+        <w:t>Környezet:</w:t>
+      </w:r>
+      <w:r>
+        <w:rPr>
+          <w:rFonts w:ascii="Times New Roman" w:eastAsia="Times New Roman" w:hAnsi="Times New Roman" w:cs="Times New Roman"/>
+          <w:sz w:val="36"/>
+          <w:szCs w:val="36"/>
+          <w:lang w:eastAsia="hu-HU"/>
+        </w:rPr>
+        <w:t xml:space="preserve"> Windows 11, .NET 9</w:t>
+      </w:r>
+      <w:r>
+        <w:rPr>
+          <w:rFonts w:ascii="Times New Roman" w:eastAsia="Times New Roman" w:hAnsi="Times New Roman" w:cs="Times New Roman"/>
+          <w:sz w:val="36"/>
+          <w:szCs w:val="36"/>
+          <w:lang w:eastAsia="hu-HU"/>
+        </w:rPr>
+        <w:br/>
+      </w:r>
+      <w:r>
+        <w:rPr>
+          <w:rFonts w:ascii="Times New Roman" w:hAnsi="Times New Roman" w:cs="Times New Roman"/>
+          <w:b/>
+          <w:sz w:val="36"/>
+          <w:szCs w:val="36"/>
+        </w:rPr>
+        <w:t>Fejlesztői környezet</w:t>
+      </w:r>
+      <w:r>
+        <w:rPr>
+          <w:rFonts w:ascii="Times New Roman" w:hAnsi="Times New Roman" w:cs="Times New Roman"/>
+          <w:sz w:val="36"/>
+          <w:szCs w:val="36"/>
+        </w:rPr>
+        <w:t>: Visual Studio 2022</w:t>
+      </w:r>
+    </w:p>
+    <w:p>
+      <w:pPr>
+        <w:pStyle w:val="Cmsor2"/>
+        <w:rPr>
+          <w:b w:val="0"/>
+          <w:sz w:val="44"/>
+          <w:szCs w:val="44"/>
+        </w:rPr>
+      </w:pPr>
+      <w:r>
+        <w:rPr>
+          <w:b w:val="0"/>
+          <w:sz w:val="44"/>
+          <w:szCs w:val="44"/>
+        </w:rPr>
+        <w:t>2. Teszt célja</w:t>
+      </w:r>
+    </w:p>
+    <w:p>
+      <w:pPr>
+        <w:pStyle w:val="NormlWeb"/>
+        <w:jc w:val="both"/>
+        <w:rPr>
+          <w:sz w:val="36"/>
+          <w:szCs w:val="36"/>
+        </w:rPr>
+      </w:pPr>
+      <w:r>
+        <w:rPr>
+          <w:sz w:val="36"/>
+          <w:szCs w:val="36"/>
+        </w:rPr>
+        <w:t>A tesztelés célja az alkalmazás alapvető működésének ellenőrzése, különösen a ViewModel logika, a parancskezelés és az adatbinding helyességének vizsgálata.</w:t>
+      </w:r>
+    </w:p>
+    <w:p>
+      <w:pPr>
+        <w:pStyle w:val="NormlWeb"/>
+        <w:rPr>
+          <w:sz w:val="44"/>
+          <w:szCs w:val="44"/>
+        </w:rPr>
+      </w:pPr>
+      <w:r>
+        <w:rPr>
+          <w:noProof/>
+          <w:sz w:val="44"/>
+          <w:szCs w:val="44"/>
+        </w:rPr>
+        <w:drawing>
+          <wp:anchor distT="0" distB="0" distL="114300" distR="114300" simplePos="0" relativeHeight="251658240" behindDoc="0" locked="0" layoutInCell="1" allowOverlap="1" wp14:anchorId="35D773B3" wp14:editId="7641994F">
+            <wp:simplePos x="0" y="0"/>
+            <wp:positionH relativeFrom="margin">
+              <wp:align>center</wp:align>
+            </wp:positionH>
+            <wp:positionV relativeFrom="paragraph">
+              <wp:posOffset>530225</wp:posOffset>
+            </wp:positionV>
+            <wp:extent cx="6835140" cy="3873500"/>
+            <wp:effectExtent l="0" t="0" r="3810" b="0"/>
+            <wp:wrapSquare wrapText="bothSides"/>
+            <wp:docPr id="1" name="Kép 1"/>
+            <wp:cNvGraphicFramePr>
+              <a:graphicFrameLocks xmlns:a="http://schemas.openxmlformats.org/drawingml/2006/main" noChangeAspect="1"/>
+            </wp:cNvGraphicFramePr>
+            <a:graphic xmlns:a="http://schemas.openxmlformats.org/drawingml/2006/main">
+              <a:graphicData uri="http://schemas.openxmlformats.org/drawingml/2006/picture">
+                <pic:pic xmlns:pic="http://schemas.openxmlformats.org/drawingml/2006/picture">
+                  <pic:nvPicPr>
+                    <pic:cNvPr id="1" name="test_table.png"/>
+                    <pic:cNvPicPr/>
+                  </pic:nvPicPr>
+                  <pic:blipFill>
+                    <a:blip r:embed="rId5">
+                      <a:extLst>
+                        <a:ext uri="{28A0092B-C50C-407E-A947-70E740481C1C}">
+                          <a14:useLocalDpi xmlns:a14="http://schemas.microsoft.com/office/drawing/2010/main" val="0"/>
+                        </a:ext>
+                      </a:extLst>
+                    </a:blip>
+                    <a:stretch>
+                      <a:fillRect/>
+                    </a:stretch>
+                  </pic:blipFill>
+                  <pic:spPr>
+                    <a:xfrm>
+                      <a:off x="0" y="0"/>
+                      <a:ext cx="6835140" cy="3873500"/>
+                    </a:xfrm>
+                    <a:prstGeom prst="rect">
+                      <a:avLst/>
+                    </a:prstGeom>
+                  </pic:spPr>
+                </pic:pic>
+              </a:graphicData>
+            </a:graphic>
+            <wp14:sizeRelH relativeFrom="margin">
+              <wp14:pctWidth>0</wp14:pctWidth>
+            </wp14:sizeRelH>
+            <wp14:sizeRelV relativeFrom="margin">
+              <wp14:pctHeight>0</wp14:pctHeight>
+            </wp14:sizeRelV>
+          </wp:anchor>
+        </w:drawing>
+      </w:r>
+      <w:r>
+        <w:rPr>
+          <w:sz w:val="44"/>
+          <w:szCs w:val="44"/>
+        </w:rPr>
+        <w:t>3. Tesztesetek</w:t>
+      </w:r>
+    </w:p>
+    <w:p>
+      <w:pPr>
+        <w:rPr>
+          <w:rFonts w:ascii="Times New Roman" w:eastAsia="Times New Roman" w:hAnsi="Times New Roman" w:cs="Times New Roman"/>
+          <w:sz w:val="36"/>
+          <w:szCs w:val="36"/>
+          <w:lang w:eastAsia="hu-HU"/>
+        </w:rPr>
+      </w:pPr>
+      <w:r>
+        <w:rPr>
+          <w:sz w:val="36"/>
+          <w:szCs w:val="36"/>
+        </w:rPr>
+        <w:br w:type="page"/>
+      </w:r>
+    </w:p>
+    <w:p>
+      <w:pPr>
+        <w:pStyle w:val="Cmsor2"/>
+        <w:rPr>
+          <w:b w:val="0"/>
+          <w:sz w:val="44"/>
+          <w:szCs w:val="44"/>
+        </w:rPr>
+      </w:pPr>
+      <w:r>
+        <w:rPr>
+          <w:b w:val="0"/>
+          <w:sz w:val="44"/>
+          <w:szCs w:val="44"/>
+        </w:rPr>
+        <w:lastRenderedPageBreak/>
+        <w:t>4</w:t>
+      </w:r>
+      <w:r>
+        <w:rPr>
+          <w:b w:val="0"/>
+          <w:sz w:val="44"/>
+          <w:szCs w:val="44"/>
+        </w:rPr>
+        <w:t>. Talált hibák</w:t>
+      </w:r>
+    </w:p>
+    <w:tbl>
+      <w:tblPr>
+        <w:tblStyle w:val="Rcsostblzat"/>
+        <w:tblW w:w="9351" w:type="dxa"/>
+        <w:jc w:val="center"/>
+        <w:tblLook w:val="04A0" w:firstRow="1" w:lastRow="0" w:firstColumn="1" w:lastColumn="0" w:noHBand="0" w:noVBand="1"/>
+      </w:tblPr>
+      <w:tblGrid>
+        <w:gridCol w:w="988"/>
+        <w:gridCol w:w="3542"/>
+        <w:gridCol w:w="2553"/>
+        <w:gridCol w:w="2268"/>
+      </w:tblGrid>
+      <w:tr>
+        <w:trPr>
+          <w:jc w:val="center"/>
+        </w:trPr>
+        <w:tc>
+          <w:tcPr>
+            <w:tcW w:w="988" w:type="dxa"/>
+            <w:vAlign w:val="center"/>
+          </w:tcPr>
+          <w:p>
+            <w:pPr>
+              <w:pStyle w:val="Cmsor2"/>
+              <w:jc w:val="center"/>
+              <w:outlineLvl w:val="1"/>
+            </w:pPr>
+            <w:r>
+              <w:t>ID</w:t>
+            </w:r>
+          </w:p>
+        </w:tc>
+        <w:tc>
+          <w:tcPr>
+            <w:tcW w:w="3542" w:type="dxa"/>
+            <w:vAlign w:val="center"/>
+          </w:tcPr>
+          <w:p>
+            <w:pPr>
+              <w:pStyle w:val="Cmsor2"/>
+              <w:jc w:val="center"/>
+              <w:outlineLvl w:val="1"/>
+            </w:pPr>
+            <w:r>
+              <w:t>Leírás</w:t>
+            </w:r>
+          </w:p>
+        </w:tc>
+        <w:tc>
+          <w:tcPr>
+            <w:tcW w:w="2553" w:type="dxa"/>
+            <w:vAlign w:val="center"/>
+          </w:tcPr>
+          <w:p>
+            <w:pPr>
+              <w:pStyle w:val="Cmsor2"/>
+              <w:jc w:val="center"/>
+              <w:outlineLvl w:val="1"/>
+            </w:pPr>
+            <w:r>
+              <w:t>Súlyosság</w:t>
+            </w:r>
+          </w:p>
+        </w:tc>
+        <w:tc>
+          <w:tcPr>
+            <w:tcW w:w="2268" w:type="dxa"/>
+            <w:vAlign w:val="center"/>
+          </w:tcPr>
+          <w:p>
+            <w:pPr>
+              <w:pStyle w:val="Cmsor2"/>
+              <w:jc w:val="center"/>
+              <w:outlineLvl w:val="1"/>
+            </w:pPr>
+            <w:r>
+              <w:t>Állapot</w:t>
+            </w:r>
+          </w:p>
+        </w:tc>
+      </w:tr>
+      <w:tr>
+        <w:trPr>
+          <w:jc w:val="center"/>
+        </w:trPr>
+        <w:tc>
+          <w:tcPr>
+            <w:tcW w:w="988" w:type="dxa"/>
+            <w:vAlign w:val="center"/>
+          </w:tcPr>
+          <w:p>
+            <w:pPr>
+              <w:pStyle w:val="Cmsor2"/>
+              <w:jc w:val="center"/>
+              <w:outlineLvl w:val="1"/>
+              <w:rPr>
+                <w:b w:val="0"/>
+              </w:rPr>
+            </w:pPr>
+            <w:r>
+              <w:rPr>
+                <w:b w:val="0"/>
+              </w:rPr>
+              <w:t>H1</w:t>
+            </w:r>
+          </w:p>
+        </w:tc>
+        <w:tc>
+          <w:tcPr>
+            <w:tcW w:w="3542" w:type="dxa"/>
+            <w:vAlign w:val="center"/>
+          </w:tcPr>
+          <w:p>
+            <w:pPr>
+              <w:pStyle w:val="Cmsor2"/>
+              <w:jc w:val="center"/>
+              <w:outlineLvl w:val="1"/>
+              <w:rPr>
+                <w:b w:val="0"/>
+              </w:rPr>
+            </w:pPr>
+            <w:r>
+              <w:rPr>
+                <w:b w:val="0"/>
+              </w:rPr>
+              <w:t>Trailer mező a törlése után bennmaradt az SQL syntaxban így működés képtelenné teszi az oldalt</w:t>
+            </w:r>
+          </w:p>
+        </w:tc>
+        <w:tc>
+          <w:tcPr>
+            <w:tcW w:w="2553" w:type="dxa"/>
+            <w:vAlign w:val="center"/>
+          </w:tcPr>
+          <w:p>
+            <w:pPr>
+              <w:pStyle w:val="Cmsor2"/>
+              <w:jc w:val="center"/>
+              <w:outlineLvl w:val="1"/>
+              <w:rPr>
+                <w:b w:val="0"/>
+              </w:rPr>
+            </w:pPr>
+            <w:r>
+              <w:rPr>
+                <w:b w:val="0"/>
+              </w:rPr>
+              <w:t>Súlyos</w:t>
+            </w:r>
+          </w:p>
+        </w:tc>
+        <w:tc>
+          <w:tcPr>
+            <w:tcW w:w="2268" w:type="dxa"/>
+            <w:vAlign w:val="center"/>
+          </w:tcPr>
+          <w:p>
+            <w:pPr>
+              <w:pStyle w:val="Cmsor2"/>
+              <w:jc w:val="center"/>
+              <w:outlineLvl w:val="1"/>
+              <w:rPr>
+                <w:b w:val="0"/>
+              </w:rPr>
+            </w:pPr>
+            <w:r>
+              <w:rPr>
+                <w:b w:val="0"/>
+              </w:rPr>
+              <w:t>Javítva</w:t>
+            </w:r>
+          </w:p>
+        </w:tc>
+      </w:tr>
+      <w:tr>
+        <w:trPr>
+          <w:jc w:val="center"/>
+        </w:trPr>
+        <w:tc>
+          <w:tcPr>
+            <w:tcW w:w="988" w:type="dxa"/>
+            <w:vAlign w:val="center"/>
+          </w:tcPr>
+          <w:p>
+            <w:pPr>
+              <w:pStyle w:val="Cmsor2"/>
+              <w:jc w:val="center"/>
+              <w:outlineLvl w:val="1"/>
+              <w:rPr>
+                <w:b w:val="0"/>
+              </w:rPr>
+            </w:pPr>
+            <w:r>
+              <w:rPr>
+                <w:b w:val="0"/>
+              </w:rPr>
+              <w:t>H2</w:t>
+            </w:r>
+          </w:p>
+        </w:tc>
+        <w:tc>
+          <w:tcPr>
+            <w:tcW w:w="3542" w:type="dxa"/>
+            <w:vAlign w:val="center"/>
+          </w:tcPr>
+          <w:p>
+            <w:pPr>
+              <w:pStyle w:val="Cmsor2"/>
+              <w:jc w:val="center"/>
+              <w:outlineLvl w:val="1"/>
+              <w:rPr>
+                <w:b w:val="0"/>
+              </w:rPr>
+            </w:pPr>
+            <w:r>
+              <w:rPr>
+                <w:b w:val="0"/>
+              </w:rPr>
+              <w:t>Trailer input a wpf nézetben</w:t>
+            </w:r>
+          </w:p>
+        </w:tc>
+        <w:tc>
+          <w:tcPr>
+            <w:tcW w:w="2553" w:type="dxa"/>
+            <w:vAlign w:val="center"/>
+          </w:tcPr>
+          <w:p>
+            <w:pPr>
+              <w:pStyle w:val="Cmsor2"/>
+              <w:jc w:val="center"/>
+              <w:outlineLvl w:val="1"/>
+              <w:rPr>
+                <w:b w:val="0"/>
+              </w:rPr>
+            </w:pPr>
+            <w:r>
+              <w:rPr>
+                <w:b w:val="0"/>
+              </w:rPr>
+              <w:t>Alacsony</w:t>
+            </w:r>
+          </w:p>
+        </w:tc>
+        <w:tc>
+          <w:tcPr>
+            <w:tcW w:w="2268" w:type="dxa"/>
+            <w:vAlign w:val="center"/>
+          </w:tcPr>
+          <w:p>
+            <w:pPr>
+              <w:pStyle w:val="Cmsor2"/>
+              <w:jc w:val="center"/>
+              <w:outlineLvl w:val="1"/>
+              <w:rPr>
+                <w:b w:val="0"/>
+              </w:rPr>
+            </w:pPr>
+            <w:r>
+              <w:rPr>
+                <w:b w:val="0"/>
+              </w:rPr>
+              <w:t>Javítva</w:t>
+            </w:r>
+          </w:p>
+        </w:tc>
+      </w:tr>
+    </w:tbl>
+    <w:p>
+      <w:pPr>
+        <w:spacing w:before="960" w:after="100" w:afterAutospacing="1" w:line="240" w:lineRule="auto"/>
+        <w:outlineLvl w:val="1"/>
+        <w:rPr>
+          <w:rFonts w:ascii="Times New Roman" w:eastAsia="Times New Roman" w:hAnsi="Times New Roman" w:cs="Times New Roman"/>
+          <w:bCs/>
+          <w:sz w:val="44"/>
+          <w:szCs w:val="44"/>
+          <w:lang w:eastAsia="hu-HU"/>
+        </w:rPr>
+      </w:pPr>
+      <w:r>
+        <w:rPr>
+          <w:rFonts w:ascii="Times New Roman" w:eastAsia="Times New Roman" w:hAnsi="Times New Roman" w:cs="Times New Roman"/>
+          <w:bCs/>
+          <w:sz w:val="44"/>
+          <w:szCs w:val="44"/>
+          <w:lang w:eastAsia="hu-HU"/>
+        </w:rPr>
+        <w:t>5</w:t>
+      </w:r>
+      <w:r>
+        <w:rPr>
+          <w:rFonts w:ascii="Times New Roman" w:eastAsia="Times New Roman" w:hAnsi="Times New Roman" w:cs="Times New Roman"/>
+          <w:bCs/>
+          <w:sz w:val="44"/>
+          <w:szCs w:val="44"/>
+          <w:lang w:eastAsia="hu-HU"/>
+        </w:rPr>
+        <w:t>. Összegzés</w:t>
+      </w:r>
+    </w:p>
+    <w:p>
+      <w:pPr>
+        <w:numPr>
+          <w:ilvl w:val="0"/>
+          <w:numId w:val="1"/>
+        </w:numPr>
+        <w:spacing w:before="100" w:beforeAutospacing="1" w:after="100" w:afterAutospacing="1" w:line="240" w:lineRule="auto"/>
+        <w:rPr>
+          <w:rFonts w:ascii="Times New Roman" w:eastAsia="Times New Roman" w:hAnsi="Times New Roman" w:cs="Times New Roman"/>
+          <w:sz w:val="36"/>
+          <w:szCs w:val="36"/>
+          <w:lang w:eastAsia="hu-HU"/>
+        </w:rPr>
+      </w:pPr>
+      <w:r>
+        <w:rPr>
+          <w:rFonts w:ascii="Times New Roman" w:eastAsia="Times New Roman" w:hAnsi="Times New Roman" w:cs="Times New Roman"/>
+          <w:sz w:val="36"/>
+          <w:szCs w:val="36"/>
+          <w:lang w:eastAsia="hu-HU"/>
+        </w:rPr>
+        <w:t>Összes teszteset: 10</w:t>
+      </w:r>
+    </w:p>
+    <w:p>
+      <w:pPr>
+        <w:numPr>
+          <w:ilvl w:val="0"/>
+          <w:numId w:val="1"/>
+        </w:numPr>
+        <w:spacing w:before="100" w:beforeAutospacing="1" w:after="100" w:afterAutospacing="1" w:line="240" w:lineRule="auto"/>
+        <w:rPr>
+          <w:rFonts w:ascii="Times New Roman" w:eastAsia="Times New Roman" w:hAnsi="Times New Roman" w:cs="Times New Roman"/>
+          <w:sz w:val="36"/>
+          <w:szCs w:val="36"/>
+          <w:lang w:eastAsia="hu-HU"/>
+        </w:rPr>
+      </w:pPr>
+      <w:r>
+        <w:rPr>
+          <w:rFonts w:ascii="Times New Roman" w:eastAsia="Times New Roman" w:hAnsi="Times New Roman" w:cs="Times New Roman"/>
+          <w:sz w:val="36"/>
+          <w:szCs w:val="36"/>
+          <w:lang w:eastAsia="hu-HU"/>
+        </w:rPr>
+        <w:t>Sikeres: 9</w:t>
+      </w:r>
+    </w:p>
+    <w:p>
+      <w:pPr>
+        <w:numPr>
+          <w:ilvl w:val="0"/>
+          <w:numId w:val="1"/>
+        </w:numPr>
+        <w:spacing w:before="100" w:beforeAutospacing="1" w:after="100" w:afterAutospacing="1" w:line="240" w:lineRule="auto"/>
+        <w:rPr>
+          <w:rFonts w:ascii="Times New Roman" w:eastAsia="Times New Roman" w:hAnsi="Times New Roman" w:cs="Times New Roman"/>
+          <w:sz w:val="36"/>
+          <w:szCs w:val="36"/>
+          <w:lang w:eastAsia="hu-HU"/>
+        </w:rPr>
+      </w:pPr>
+      <w:r>
+        <w:rPr>
+          <w:rFonts w:ascii="Times New Roman" w:eastAsia="Times New Roman" w:hAnsi="Times New Roman" w:cs="Times New Roman"/>
+          <w:sz w:val="36"/>
+          <w:szCs w:val="36"/>
+          <w:lang w:eastAsia="hu-HU"/>
+        </w:rPr>
+        <w:t>Sikertelen: 1</w:t>
+      </w:r>
+    </w:p>
+    <w:p>
+      <w:pPr>
+        <w:spacing w:before="100" w:beforeAutospacing="1" w:after="100" w:afterAutospacing="1" w:line="240" w:lineRule="auto"/>
+        <w:rPr>
+          <w:rFonts w:ascii="Times New Roman" w:eastAsia="Times New Roman" w:hAnsi="Times New Roman" w:cs="Times New Roman"/>
           <w:sz w:val="40"/>
           <w:szCs w:val="40"/>
-        </w:rPr>
-      </w:pPr>
-      <w:r>
-        <w:rPr>
-          <w:rFonts w:ascii="Times New Roman" w:hAnsi="Times New Roman" w:cs="Times New Roman"/>
+          <w:lang w:eastAsia="hu-HU"/>
+        </w:rPr>
+      </w:pPr>
+      <w:r>
+        <w:rPr>
+          <w:rFonts w:ascii="Times New Roman" w:eastAsia="Times New Roman" w:hAnsi="Times New Roman" w:cs="Times New Roman"/>
           <w:b/>
+          <w:bCs/>
           <w:sz w:val="40"/>
           <w:szCs w:val="40"/>
-        </w:rPr>
-        <w:t>CosmoScreen tesztelési dokumentáció</w:t>
+          <w:lang w:eastAsia="hu-HU"/>
+        </w:rPr>
+        <w:t>Értékelés:</w:t>
       </w:r>
     </w:p>
     <w:p>
       <w:pPr>
         <w:spacing w:before="100" w:beforeAutospacing="1" w:after="100" w:afterAutospacing="1" w:line="240" w:lineRule="auto"/>
-        <w:outlineLvl w:val="1"/>
-        <w:rPr>
-          <w:rFonts w:ascii="Times New Roman" w:eastAsia="Times New Roman" w:hAnsi="Times New Roman" w:cs="Times New Roman"/>
-          <w:bCs/>
-          <w:sz w:val="36"/>
-          <w:szCs w:val="36"/>
-          <w:lang w:eastAsia="hu-HU"/>
-        </w:rPr>
-      </w:pPr>
-      <w:r>
-        <w:rPr>
-          <w:rFonts w:ascii="Times New Roman" w:eastAsia="Times New Roman" w:hAnsi="Times New Roman" w:cs="Times New Roman"/>
-          <w:bCs/>
-          <w:sz w:val="36"/>
-          <w:szCs w:val="36"/>
-          <w:lang w:eastAsia="hu-HU"/>
-        </w:rPr>
-        <w:t>1. Alapadatok</w:t>
+        <w:jc w:val="both"/>
+        <w:rPr>
+          <w:rFonts w:ascii="Times New Roman" w:eastAsia="Times New Roman" w:hAnsi="Times New Roman" w:cs="Times New Roman"/>
+          <w:sz w:val="36"/>
+          <w:szCs w:val="36"/>
+          <w:lang w:eastAsia="hu-HU"/>
+        </w:rPr>
+      </w:pPr>
+      <w:r>
+        <w:rPr>
+          <w:rFonts w:ascii="Times New Roman" w:eastAsia="Times New Roman" w:hAnsi="Times New Roman" w:cs="Times New Roman"/>
+          <w:sz w:val="36"/>
+          <w:szCs w:val="36"/>
+          <w:lang w:eastAsia="hu-HU"/>
+        </w:rPr>
+        <w:t>Az alkalmazás alapvető funkciói megfelelően működnek. Kisebb hibák előfordulnak, de ezek nem befolyásolják jelentősen a működést. Az alkalmazás jelenlegi állapotában kiadható további finomhangolással.</w:t>
       </w:r>
     </w:p>
     <w:p>
       <w:pPr>
-        <w:spacing w:before="100" w:beforeAutospacing="1" w:after="100" w:afterAutospacing="1" w:line="240" w:lineRule="auto"/>
-        <w:rPr>
-          <w:rFonts w:ascii="Times New Roman" w:eastAsia="Times New Roman" w:hAnsi="Times New Roman" w:cs="Times New Roman"/>
-          <w:sz w:val="28"/>
-          <w:szCs w:val="28"/>
-          <w:lang w:eastAsia="hu-HU"/>
-        </w:rPr>
-      </w:pPr>
-      <w:r>
-        <w:rPr>
-          <w:rFonts w:ascii="Times New Roman" w:eastAsia="Times New Roman" w:hAnsi="Times New Roman" w:cs="Times New Roman"/>
-          <w:b/>
-          <w:bCs/>
-          <w:sz w:val="28"/>
-          <w:szCs w:val="28"/>
-          <w:lang w:eastAsia="hu-HU"/>
-        </w:rPr>
-        <w:t>Projekt neve:</w:t>
-      </w:r>
-      <w:r>
-        <w:rPr>
-          <w:rFonts w:ascii="Times New Roman" w:eastAsia="Times New Roman" w:hAnsi="Times New Roman" w:cs="Times New Roman"/>
-          <w:sz w:val="28"/>
-          <w:szCs w:val="28"/>
-          <w:lang w:eastAsia="hu-HU"/>
-        </w:rPr>
-        <w:t xml:space="preserve"> </w:t>
-      </w:r>
-      <w:r>
-        <w:rPr>
-          <w:rFonts w:ascii="Times New Roman" w:eastAsia="Times New Roman" w:hAnsi="Times New Roman" w:cs="Times New Roman"/>
-          <w:sz w:val="28"/>
-          <w:szCs w:val="28"/>
-          <w:lang w:eastAsia="hu-HU"/>
-        </w:rPr>
-        <w:t>CosmoScreen</w:t>
-      </w:r>
-      <w:r>
-        <w:rPr>
-          <w:rFonts w:ascii="Times New Roman" w:eastAsia="Times New Roman" w:hAnsi="Times New Roman" w:cs="Times New Roman"/>
-          <w:sz w:val="28"/>
-          <w:szCs w:val="28"/>
-          <w:lang w:eastAsia="hu-HU"/>
-        </w:rPr>
-        <w:br/>
-      </w:r>
-      <w:r>
-        <w:rPr>
-          <w:rFonts w:ascii="Times New Roman" w:eastAsia="Times New Roman" w:hAnsi="Times New Roman" w:cs="Times New Roman"/>
-          <w:b/>
-          <w:bCs/>
-          <w:sz w:val="28"/>
-          <w:szCs w:val="28"/>
-          <w:lang w:eastAsia="hu-HU"/>
-        </w:rPr>
-        <w:t>Alkalmazás típusa:</w:t>
-      </w:r>
-      <w:r>
-        <w:rPr>
-          <w:rFonts w:ascii="Times New Roman" w:eastAsia="Times New Roman" w:hAnsi="Times New Roman" w:cs="Times New Roman"/>
-          <w:sz w:val="28"/>
-          <w:szCs w:val="28"/>
-          <w:lang w:eastAsia="hu-HU"/>
-        </w:rPr>
-        <w:t xml:space="preserve"> WPF desktop alkalmazás</w:t>
-      </w:r>
-      <w:r>
-        <w:rPr>
-          <w:rFonts w:ascii="Times New Roman" w:eastAsia="Times New Roman" w:hAnsi="Times New Roman" w:cs="Times New Roman"/>
-          <w:sz w:val="28"/>
-          <w:szCs w:val="28"/>
-          <w:lang w:eastAsia="hu-HU"/>
-        </w:rPr>
-        <w:br/>
-      </w:r>
-      <w:r>
-        <w:rPr>
-          <w:rFonts w:ascii="Times New Roman" w:eastAsia="Times New Roman" w:hAnsi="Times New Roman" w:cs="Times New Roman"/>
-          <w:b/>
-          <w:bCs/>
-          <w:sz w:val="28"/>
-          <w:szCs w:val="28"/>
-          <w:lang w:eastAsia="hu-HU"/>
-        </w:rPr>
-        <w:t>Tesztelő:</w:t>
-      </w:r>
-      <w:r>
-        <w:rPr>
-          <w:rFonts w:ascii="Times New Roman" w:eastAsia="Times New Roman" w:hAnsi="Times New Roman" w:cs="Times New Roman"/>
-          <w:sz w:val="28"/>
-          <w:szCs w:val="28"/>
-          <w:lang w:eastAsia="hu-HU"/>
-        </w:rPr>
-        <w:t xml:space="preserve"> </w:t>
-      </w:r>
-      <w:r>
-        <w:rPr>
-          <w:rFonts w:ascii="Times New Roman" w:eastAsia="Times New Roman" w:hAnsi="Times New Roman" w:cs="Times New Roman"/>
-          <w:sz w:val="28"/>
-          <w:szCs w:val="28"/>
-          <w:lang w:eastAsia="hu-HU"/>
-        </w:rPr>
-        <w:t>Kriván Balázs, Fodor Adrián László</w:t>
-      </w:r>
-      <w:r>
-        <w:rPr>
-          <w:rFonts w:ascii="Times New Roman" w:eastAsia="Times New Roman" w:hAnsi="Times New Roman" w:cs="Times New Roman"/>
-          <w:sz w:val="28"/>
-          <w:szCs w:val="28"/>
-          <w:lang w:eastAsia="hu-HU"/>
-        </w:rPr>
-        <w:br/>
-      </w:r>
-      <w:r>
-        <w:rPr>
-          <w:rFonts w:ascii="Times New Roman" w:eastAsia="Times New Roman" w:hAnsi="Times New Roman" w:cs="Times New Roman"/>
-          <w:b/>
-          <w:bCs/>
-          <w:sz w:val="28"/>
-          <w:szCs w:val="28"/>
-          <w:lang w:eastAsia="hu-HU"/>
-        </w:rPr>
-        <w:t>Környezet:</w:t>
-      </w:r>
-      <w:r>
-        <w:rPr>
-          <w:rFonts w:ascii="Times New Roman" w:eastAsia="Times New Roman" w:hAnsi="Times New Roman" w:cs="Times New Roman"/>
-          <w:sz w:val="28"/>
-          <w:szCs w:val="28"/>
-          <w:lang w:eastAsia="hu-HU"/>
-        </w:rPr>
-        <w:t xml:space="preserve"> Windows 11, .NET </w:t>
-      </w:r>
-      <w:r>
-        <w:rPr>
-          <w:rFonts w:ascii="Times New Roman" w:eastAsia="Times New Roman" w:hAnsi="Times New Roman" w:cs="Times New Roman"/>
-          <w:sz w:val="28"/>
-          <w:szCs w:val="28"/>
-          <w:lang w:eastAsia="hu-HU"/>
-        </w:rPr>
-        <w:t>9</w:t>
+        <w:rPr>
+          <w:rFonts w:ascii="Times New Roman" w:eastAsia="Times New Roman" w:hAnsi="Times New Roman" w:cs="Times New Roman"/>
+          <w:sz w:val="36"/>
+          <w:szCs w:val="36"/>
+          <w:lang w:eastAsia="hu-HU"/>
+        </w:rPr>
+      </w:pPr>
+      <w:r>
+        <w:rPr>
+          <w:rFonts w:ascii="Times New Roman" w:eastAsia="Times New Roman" w:hAnsi="Times New Roman" w:cs="Times New Roman"/>
+          <w:sz w:val="36"/>
+          <w:szCs w:val="36"/>
+          <w:lang w:eastAsia="hu-HU"/>
+        </w:rPr>
+        <w:br w:type="page"/>
       </w:r>
     </w:p>
     <w:p>
       <w:pPr>
-        <w:pStyle w:val="Cmsor2"/>
-        <w:rPr>
-          <w:b w:val="0"/>
-        </w:rPr>
-      </w:pPr>
-      <w:r>
-        <w:rPr>
-          <w:b w:val="0"/>
-        </w:rPr>
-        <w:t>2. Teszt célja</w:t>
+        <w:spacing w:before="480" w:after="100" w:afterAutospacing="1" w:line="240" w:lineRule="auto"/>
+        <w:jc w:val="both"/>
+        <w:rPr>
+          <w:rFonts w:ascii="Times New Roman" w:hAnsi="Times New Roman" w:cs="Times New Roman"/>
+          <w:sz w:val="44"/>
+          <w:szCs w:val="44"/>
+        </w:rPr>
+      </w:pPr>
+      <w:r>
+        <w:rPr>
+          <w:rFonts w:ascii="Times New Roman" w:hAnsi="Times New Roman" w:cs="Times New Roman"/>
+          <w:sz w:val="44"/>
+          <w:szCs w:val="44"/>
+        </w:rPr>
+        <w:lastRenderedPageBreak/>
+        <w:t>6</w:t>
+      </w:r>
+      <w:r>
+        <w:rPr>
+          <w:rFonts w:ascii="Times New Roman" w:hAnsi="Times New Roman" w:cs="Times New Roman"/>
+          <w:sz w:val="44"/>
+          <w:szCs w:val="44"/>
+        </w:rPr>
+        <w:t>. Mellékletek</w:t>
       </w:r>
     </w:p>
     <w:p>
       <w:pPr>
-        <w:pStyle w:val="NormlWeb"/>
-        <w:rPr>
-          <w:sz w:val="28"/>
-          <w:szCs w:val="28"/>
-        </w:rPr>
-      </w:pPr>
-      <w:r>
-        <w:rPr>
-          <w:sz w:val="28"/>
-          <w:szCs w:val="28"/>
-        </w:rPr>
-        <w:t xml:space="preserve">A tesztelés célja az alkalmazás alapvető működésének ellenőrzése, különösen a </w:t>
-      </w:r>
-      <w:proofErr w:type="spellStart"/>
-      <w:r>
-        <w:rPr>
-          <w:sz w:val="28"/>
-          <w:szCs w:val="28"/>
-        </w:rPr>
-        <w:t>ViewModel</w:t>
-      </w:r>
-      <w:proofErr w:type="spellEnd"/>
-      <w:r>
-        <w:rPr>
-          <w:sz w:val="28"/>
-          <w:szCs w:val="28"/>
-        </w:rPr>
-        <w:t xml:space="preserve"> logika, a parancskezelés és az </w:t>
-      </w:r>
-      <w:proofErr w:type="spellStart"/>
-      <w:r>
-        <w:rPr>
-          <w:sz w:val="28"/>
-          <w:szCs w:val="28"/>
-        </w:rPr>
-        <w:t>adatbinding</w:t>
-      </w:r>
-      <w:proofErr w:type="spellEnd"/>
-      <w:r>
-        <w:rPr>
-          <w:sz w:val="28"/>
-          <w:szCs w:val="28"/>
-        </w:rPr>
-        <w:t xml:space="preserve"> helyességének vizsgálata.</w:t>
+        <w:spacing w:before="480" w:after="100" w:afterAutospacing="1" w:line="240" w:lineRule="auto"/>
+        <w:jc w:val="both"/>
+        <w:rPr>
+          <w:rFonts w:ascii="Times New Roman" w:hAnsi="Times New Roman" w:cs="Times New Roman"/>
+          <w:sz w:val="36"/>
+          <w:szCs w:val="36"/>
+        </w:rPr>
+      </w:pPr>
+      <w:r>
+        <w:rPr>
+          <w:rFonts w:ascii="Times New Roman" w:hAnsi="Times New Roman" w:cs="Times New Roman"/>
+          <w:noProof/>
+          <w:sz w:val="36"/>
+          <w:szCs w:val="36"/>
+        </w:rPr>
+        <w:drawing>
+          <wp:anchor distT="0" distB="0" distL="114300" distR="114300" simplePos="0" relativeHeight="251661312" behindDoc="0" locked="0" layoutInCell="1" allowOverlap="1" wp14:anchorId="02C3896A" wp14:editId="08617C1B">
+            <wp:simplePos x="0" y="0"/>
+            <wp:positionH relativeFrom="margin">
+              <wp:align>center</wp:align>
+            </wp:positionH>
+            <wp:positionV relativeFrom="paragraph">
+              <wp:posOffset>991870</wp:posOffset>
+            </wp:positionV>
+            <wp:extent cx="5956935" cy="5210810"/>
+            <wp:effectExtent l="0" t="0" r="5715" b="8890"/>
+            <wp:wrapSquare wrapText="bothSides"/>
+            <wp:docPr id="4" name="Kép 4"/>
+            <wp:cNvGraphicFramePr>
+              <a:graphicFrameLocks xmlns:a="http://schemas.openxmlformats.org/drawingml/2006/main" noChangeAspect="1"/>
+            </wp:cNvGraphicFramePr>
+            <a:graphic xmlns:a="http://schemas.openxmlformats.org/drawingml/2006/main">
+              <a:graphicData uri="http://schemas.openxmlformats.org/drawingml/2006/picture">
+                <pic:pic xmlns:pic="http://schemas.openxmlformats.org/drawingml/2006/picture">
+                  <pic:nvPicPr>
+                    <pic:cNvPr id="4" name="filmek.png"/>
+                    <pic:cNvPicPr/>
+                  </pic:nvPicPr>
+                  <pic:blipFill>
+                    <a:blip r:embed="rId6">
+                      <a:extLst>
+                        <a:ext uri="{28A0092B-C50C-407E-A947-70E740481C1C}">
+                          <a14:useLocalDpi xmlns:a14="http://schemas.microsoft.com/office/drawing/2010/main" val="0"/>
+                        </a:ext>
+                      </a:extLst>
+                    </a:blip>
+                    <a:stretch>
+                      <a:fillRect/>
+                    </a:stretch>
+                  </pic:blipFill>
+                  <pic:spPr>
+                    <a:xfrm>
+                      <a:off x="0" y="0"/>
+                      <a:ext cx="5956935" cy="5210810"/>
+                    </a:xfrm>
+                    <a:prstGeom prst="rect">
+                      <a:avLst/>
+                    </a:prstGeom>
+                  </pic:spPr>
+                </pic:pic>
+              </a:graphicData>
+            </a:graphic>
+            <wp14:sizeRelH relativeFrom="margin">
+              <wp14:pctWidth>0</wp14:pctWidth>
+            </wp14:sizeRelH>
+            <wp14:sizeRelV relativeFrom="margin">
+              <wp14:pctHeight>0</wp14:pctHeight>
+            </wp14:sizeRelV>
+          </wp:anchor>
+        </w:drawing>
+      </w:r>
+      <w:r>
+        <w:rPr>
+          <w:rFonts w:ascii="Times New Roman" w:eastAsia="Times New Roman" w:hAnsi="Times New Roman" w:cs="Times New Roman"/>
+          <w:sz w:val="36"/>
+          <w:szCs w:val="36"/>
+          <w:lang w:eastAsia="hu-HU"/>
+        </w:rPr>
+        <w:t xml:space="preserve">1. - </w:t>
+      </w:r>
+      <w:r>
+        <w:rPr>
+          <w:rFonts w:ascii="Times New Roman" w:hAnsi="Times New Roman" w:cs="Times New Roman"/>
+          <w:sz w:val="36"/>
+          <w:szCs w:val="36"/>
+        </w:rPr>
+        <w:t>A datagrid automatikusan betöltött adatokkal az alkalmazás indításakor.</w:t>
       </w:r>
     </w:p>
     <w:p>
       <w:pPr>
-        <w:pStyle w:val="NormlWeb"/>
-        <w:rPr>
-          <w:sz w:val="36"/>
-          <w:szCs w:val="36"/>
-        </w:rPr>
-      </w:pPr>
-      <w:r>
-        <w:rPr>
-          <w:sz w:val="36"/>
-          <w:szCs w:val="36"/>
-        </w:rPr>
-        <w:t>3</w:t>
-      </w:r>
-      <w:r>
-        <w:rPr>
-          <w:sz w:val="36"/>
-          <w:szCs w:val="36"/>
-        </w:rPr>
-        <w:t>. Tesztesetek</w:t>
+        <w:rPr>
+          <w:rFonts w:ascii="Times New Roman" w:hAnsi="Times New Roman" w:cs="Times New Roman"/>
+          <w:sz w:val="36"/>
+          <w:szCs w:val="36"/>
+        </w:rPr>
+      </w:pPr>
+      <w:r>
+        <w:rPr>
+          <w:rFonts w:ascii="Times New Roman" w:hAnsi="Times New Roman" w:cs="Times New Roman"/>
+          <w:sz w:val="36"/>
+          <w:szCs w:val="36"/>
+        </w:rPr>
+        <w:br w:type="page"/>
       </w:r>
     </w:p>
     <w:p>
       <w:pPr>
-        <w:pStyle w:val="NormlWeb"/>
-        <w:rPr>
-          <w:sz w:val="36"/>
-          <w:szCs w:val="36"/>
-        </w:rPr>
-      </w:pPr>
-      <w:bookmarkStart w:id="0" w:name="_GoBack"/>
-      <w:bookmarkEnd w:id="0"/>
+        <w:spacing w:before="720" w:after="100" w:afterAutospacing="1" w:line="240" w:lineRule="auto"/>
+        <w:jc w:val="both"/>
+        <w:rPr>
+          <w:rFonts w:ascii="Times New Roman" w:hAnsi="Times New Roman" w:cs="Times New Roman"/>
+          <w:sz w:val="36"/>
+          <w:szCs w:val="36"/>
+        </w:rPr>
+      </w:pPr>
+      <w:r>
+        <w:rPr>
+          <w:rFonts w:ascii="Times New Roman" w:eastAsia="Times New Roman" w:hAnsi="Times New Roman" w:cs="Times New Roman"/>
+          <w:noProof/>
+          <w:sz w:val="36"/>
+          <w:szCs w:val="36"/>
+          <w:lang w:eastAsia="hu-HU"/>
+        </w:rPr>
+        <w:lastRenderedPageBreak/>
+        <w:drawing>
+          <wp:anchor distT="0" distB="0" distL="114300" distR="114300" simplePos="0" relativeHeight="251662336" behindDoc="0" locked="0" layoutInCell="1" allowOverlap="1" wp14:anchorId="57BE63BF" wp14:editId="0EE07899">
+            <wp:simplePos x="0" y="0"/>
+            <wp:positionH relativeFrom="margin">
+              <wp:align>center</wp:align>
+            </wp:positionH>
+            <wp:positionV relativeFrom="paragraph">
+              <wp:posOffset>776605</wp:posOffset>
+            </wp:positionV>
+            <wp:extent cx="6111875" cy="5328285"/>
+            <wp:effectExtent l="0" t="0" r="3175" b="5715"/>
+            <wp:wrapSquare wrapText="bothSides"/>
+            <wp:docPr id="5" name="Kép 5"/>
+            <wp:cNvGraphicFramePr>
+              <a:graphicFrameLocks xmlns:a="http://schemas.openxmlformats.org/drawingml/2006/main" noChangeAspect="1"/>
+            </wp:cNvGraphicFramePr>
+            <a:graphic xmlns:a="http://schemas.openxmlformats.org/drawingml/2006/main">
+              <a:graphicData uri="http://schemas.openxmlformats.org/drawingml/2006/picture">
+                <pic:pic xmlns:pic="http://schemas.openxmlformats.org/drawingml/2006/picture">
+                  <pic:nvPicPr>
+                    <pic:cNvPr id="5" name="filmek2.png"/>
+                    <pic:cNvPicPr/>
+                  </pic:nvPicPr>
+                  <pic:blipFill>
+                    <a:blip r:embed="rId7">
+                      <a:extLst>
+                        <a:ext uri="{28A0092B-C50C-407E-A947-70E740481C1C}">
+                          <a14:useLocalDpi xmlns:a14="http://schemas.microsoft.com/office/drawing/2010/main" val="0"/>
+                        </a:ext>
+                      </a:extLst>
+                    </a:blip>
+                    <a:stretch>
+                      <a:fillRect/>
+                    </a:stretch>
+                  </pic:blipFill>
+                  <pic:spPr>
+                    <a:xfrm>
+                      <a:off x="0" y="0"/>
+                      <a:ext cx="6111875" cy="5328285"/>
+                    </a:xfrm>
+                    <a:prstGeom prst="rect">
+                      <a:avLst/>
+                    </a:prstGeom>
+                  </pic:spPr>
+                </pic:pic>
+              </a:graphicData>
+            </a:graphic>
+            <wp14:sizeRelH relativeFrom="margin">
+              <wp14:pctWidth>0</wp14:pctWidth>
+            </wp14:sizeRelH>
+            <wp14:sizeRelV relativeFrom="margin">
+              <wp14:pctHeight>0</wp14:pctHeight>
+            </wp14:sizeRelV>
+          </wp:anchor>
+        </w:drawing>
+      </w:r>
+      <w:r>
+        <w:rPr>
+          <w:rFonts w:ascii="Times New Roman" w:eastAsia="Times New Roman" w:hAnsi="Times New Roman" w:cs="Times New Roman"/>
+          <w:sz w:val="36"/>
+          <w:szCs w:val="36"/>
+          <w:lang w:eastAsia="hu-HU"/>
+        </w:rPr>
+        <w:t>2</w:t>
+      </w:r>
+      <w:r>
+        <w:rPr>
+          <w:rFonts w:ascii="Times New Roman" w:eastAsia="Times New Roman" w:hAnsi="Times New Roman" w:cs="Times New Roman"/>
+          <w:sz w:val="36"/>
+          <w:szCs w:val="36"/>
+          <w:lang w:eastAsia="hu-HU"/>
+        </w:rPr>
+        <w:t xml:space="preserve">. - </w:t>
+      </w:r>
+      <w:r>
+        <w:rPr>
+          <w:rFonts w:ascii="Times New Roman" w:hAnsi="Times New Roman" w:cs="Times New Roman"/>
+          <w:sz w:val="36"/>
+          <w:szCs w:val="36"/>
+        </w:rPr>
+        <w:t>A kiválasztott adatsor adatainak megjelenése az input mezőkben.</w:t>
+      </w:r>
+    </w:p>
+    <w:p>
+      <w:pPr>
+        <w:rPr>
+          <w:rFonts w:ascii="Times New Roman" w:hAnsi="Times New Roman" w:cs="Times New Roman"/>
+          <w:sz w:val="36"/>
+          <w:szCs w:val="36"/>
+        </w:rPr>
+      </w:pPr>
+      <w:r>
+        <w:rPr>
+          <w:rFonts w:ascii="Times New Roman" w:hAnsi="Times New Roman" w:cs="Times New Roman"/>
+          <w:sz w:val="36"/>
+          <w:szCs w:val="36"/>
+        </w:rPr>
+        <w:br w:type="page"/>
+      </w:r>
+    </w:p>
+    <w:p>
+      <w:pPr>
+        <w:spacing w:before="720" w:after="100" w:afterAutospacing="1" w:line="240" w:lineRule="auto"/>
+        <w:jc w:val="both"/>
+        <w:rPr>
+          <w:rFonts w:ascii="Times New Roman" w:hAnsi="Times New Roman" w:cs="Times New Roman"/>
+          <w:sz w:val="36"/>
+          <w:szCs w:val="36"/>
+        </w:rPr>
+      </w:pPr>
+      <w:r>
+        <w:rPr>
+          <w:rFonts w:ascii="Times New Roman" w:hAnsi="Times New Roman" w:cs="Times New Roman"/>
+          <w:noProof/>
+          <w:sz w:val="36"/>
+          <w:szCs w:val="36"/>
+        </w:rPr>
+        <w:lastRenderedPageBreak/>
+        <w:drawing>
+          <wp:anchor distT="0" distB="0" distL="114300" distR="114300" simplePos="0" relativeHeight="251665408" behindDoc="1" locked="0" layoutInCell="1" allowOverlap="1" wp14:anchorId="73B08824" wp14:editId="26B1BA8A">
+            <wp:simplePos x="0" y="0"/>
+            <wp:positionH relativeFrom="margin">
+              <wp:align>center</wp:align>
+            </wp:positionH>
+            <wp:positionV relativeFrom="paragraph">
+              <wp:posOffset>488315</wp:posOffset>
+            </wp:positionV>
+            <wp:extent cx="1343025" cy="1411605"/>
+            <wp:effectExtent l="0" t="0" r="9525" b="0"/>
+            <wp:wrapTopAndBottom/>
+            <wp:docPr id="8" name="Kép 8"/>
+            <wp:cNvGraphicFramePr>
+              <a:graphicFrameLocks xmlns:a="http://schemas.openxmlformats.org/drawingml/2006/main" noChangeAspect="1"/>
+            </wp:cNvGraphicFramePr>
+            <a:graphic xmlns:a="http://schemas.openxmlformats.org/drawingml/2006/main">
+              <a:graphicData uri="http://schemas.openxmlformats.org/drawingml/2006/picture">
+                <pic:pic xmlns:pic="http://schemas.openxmlformats.org/drawingml/2006/picture">
+                  <pic:nvPicPr>
+                    <pic:cNvPr id="8" name="success.png"/>
+                    <pic:cNvPicPr/>
+                  </pic:nvPicPr>
+                  <pic:blipFill>
+                    <a:blip r:embed="rId8">
+                      <a:extLst>
+                        <a:ext uri="{28A0092B-C50C-407E-A947-70E740481C1C}">
+                          <a14:useLocalDpi xmlns:a14="http://schemas.microsoft.com/office/drawing/2010/main" val="0"/>
+                        </a:ext>
+                      </a:extLst>
+                    </a:blip>
+                    <a:stretch>
+                      <a:fillRect/>
+                    </a:stretch>
+                  </pic:blipFill>
+                  <pic:spPr>
+                    <a:xfrm>
+                      <a:off x="0" y="0"/>
+                      <a:ext cx="1343025" cy="1411605"/>
+                    </a:xfrm>
+                    <a:prstGeom prst="rect">
+                      <a:avLst/>
+                    </a:prstGeom>
+                  </pic:spPr>
+                </pic:pic>
+              </a:graphicData>
+            </a:graphic>
+            <wp14:sizeRelH relativeFrom="margin">
+              <wp14:pctWidth>0</wp14:pctWidth>
+            </wp14:sizeRelH>
+            <wp14:sizeRelV relativeFrom="margin">
+              <wp14:pctHeight>0</wp14:pctHeight>
+            </wp14:sizeRelV>
+          </wp:anchor>
+        </w:drawing>
+      </w:r>
+      <w:r>
+        <w:rPr>
+          <w:rFonts w:ascii="Times New Roman" w:hAnsi="Times New Roman" w:cs="Times New Roman"/>
+          <w:noProof/>
+          <w:sz w:val="36"/>
+          <w:szCs w:val="36"/>
+        </w:rPr>
+        <w:drawing>
+          <wp:anchor distT="0" distB="0" distL="114300" distR="114300" simplePos="0" relativeHeight="251664384" behindDoc="0" locked="0" layoutInCell="1" allowOverlap="1" wp14:anchorId="1CECB967" wp14:editId="0A0F346D">
+            <wp:simplePos x="0" y="0"/>
+            <wp:positionH relativeFrom="margin">
+              <wp:align>center</wp:align>
+            </wp:positionH>
+            <wp:positionV relativeFrom="paragraph">
+              <wp:posOffset>2043430</wp:posOffset>
+            </wp:positionV>
+            <wp:extent cx="6200140" cy="3725545"/>
+            <wp:effectExtent l="0" t="0" r="0" b="8255"/>
+            <wp:wrapSquare wrapText="bothSides"/>
+            <wp:docPr id="7" name="Kép 7"/>
+            <wp:cNvGraphicFramePr>
+              <a:graphicFrameLocks xmlns:a="http://schemas.openxmlformats.org/drawingml/2006/main" noChangeAspect="1"/>
+            </wp:cNvGraphicFramePr>
+            <a:graphic xmlns:a="http://schemas.openxmlformats.org/drawingml/2006/main">
+              <a:graphicData uri="http://schemas.openxmlformats.org/drawingml/2006/picture">
+                <pic:pic xmlns:pic="http://schemas.openxmlformats.org/drawingml/2006/picture">
+                  <pic:nvPicPr>
+                    <pic:cNvPr id="7" name="filmek3.png"/>
+                    <pic:cNvPicPr/>
+                  </pic:nvPicPr>
+                  <pic:blipFill>
+                    <a:blip r:embed="rId9">
+                      <a:extLst>
+                        <a:ext uri="{28A0092B-C50C-407E-A947-70E740481C1C}">
+                          <a14:useLocalDpi xmlns:a14="http://schemas.microsoft.com/office/drawing/2010/main" val="0"/>
+                        </a:ext>
+                      </a:extLst>
+                    </a:blip>
+                    <a:stretch>
+                      <a:fillRect/>
+                    </a:stretch>
+                  </pic:blipFill>
+                  <pic:spPr>
+                    <a:xfrm>
+                      <a:off x="0" y="0"/>
+                      <a:ext cx="6200140" cy="3725545"/>
+                    </a:xfrm>
+                    <a:prstGeom prst="rect">
+                      <a:avLst/>
+                    </a:prstGeom>
+                  </pic:spPr>
+                </pic:pic>
+              </a:graphicData>
+            </a:graphic>
+            <wp14:sizeRelH relativeFrom="margin">
+              <wp14:pctWidth>0</wp14:pctWidth>
+            </wp14:sizeRelH>
+            <wp14:sizeRelV relativeFrom="margin">
+              <wp14:pctHeight>0</wp14:pctHeight>
+            </wp14:sizeRelV>
+          </wp:anchor>
+        </w:drawing>
+      </w:r>
+      <w:r>
+        <w:rPr>
+          <w:rFonts w:ascii="Times New Roman" w:hAnsi="Times New Roman" w:cs="Times New Roman"/>
+          <w:sz w:val="36"/>
+          <w:szCs w:val="36"/>
+        </w:rPr>
+        <w:t xml:space="preserve">3. </w:t>
+      </w:r>
+      <w:r>
+        <w:rPr>
+          <w:rFonts w:ascii="Times New Roman" w:hAnsi="Times New Roman" w:cs="Times New Roman"/>
+          <w:sz w:val="36"/>
+          <w:szCs w:val="36"/>
+        </w:rPr>
+        <w:t>-</w:t>
+      </w:r>
+      <w:r>
+        <w:rPr>
+          <w:rFonts w:ascii="Times New Roman" w:hAnsi="Times New Roman" w:cs="Times New Roman"/>
+          <w:sz w:val="36"/>
+          <w:szCs w:val="36"/>
+        </w:rPr>
+        <w:t xml:space="preserve"> Új adat felvétele</w:t>
+      </w:r>
+      <w:r>
+        <w:rPr>
+          <w:rFonts w:ascii="Times New Roman" w:hAnsi="Times New Roman" w:cs="Times New Roman"/>
+          <w:sz w:val="36"/>
+          <w:szCs w:val="36"/>
+        </w:rPr>
+        <w:t>, és</w:t>
+      </w:r>
+      <w:r>
+        <w:rPr>
+          <w:rFonts w:ascii="Times New Roman" w:hAnsi="Times New Roman" w:cs="Times New Roman"/>
+          <w:sz w:val="36"/>
+          <w:szCs w:val="36"/>
+        </w:rPr>
+        <w:t xml:space="preserve"> utána</w:t>
+      </w:r>
+      <w:r>
+        <w:rPr>
+          <w:rFonts w:ascii="Times New Roman" w:hAnsi="Times New Roman" w:cs="Times New Roman"/>
+          <w:sz w:val="36"/>
+          <w:szCs w:val="36"/>
+        </w:rPr>
+        <w:t xml:space="preserve"> a</w:t>
+      </w:r>
+      <w:r>
+        <w:rPr>
+          <w:rFonts w:ascii="Times New Roman" w:hAnsi="Times New Roman" w:cs="Times New Roman"/>
+          <w:sz w:val="36"/>
+          <w:szCs w:val="36"/>
+        </w:rPr>
+        <w:t xml:space="preserve"> lista frissülése a datagridben.</w:t>
+      </w:r>
+    </w:p>
+    <w:p>
+      <w:pPr>
+        <w:rPr>
+          <w:rFonts w:ascii="Times New Roman" w:hAnsi="Times New Roman" w:cs="Times New Roman"/>
+          <w:sz w:val="36"/>
+          <w:szCs w:val="36"/>
+        </w:rPr>
+      </w:pPr>
+      <w:r>
+        <w:rPr>
+          <w:rFonts w:ascii="Times New Roman" w:hAnsi="Times New Roman" w:cs="Times New Roman"/>
+          <w:sz w:val="36"/>
+          <w:szCs w:val="36"/>
+        </w:rPr>
+        <w:br w:type="page"/>
+      </w:r>
+    </w:p>
+    <w:p>
+      <w:pPr>
+        <w:spacing w:after="100" w:afterAutospacing="1" w:line="240" w:lineRule="auto"/>
+        <w:jc w:val="both"/>
+        <w:rPr>
+          <w:rFonts w:ascii="Times New Roman" w:hAnsi="Times New Roman" w:cs="Times New Roman"/>
+          <w:sz w:val="36"/>
+          <w:szCs w:val="36"/>
+        </w:rPr>
+      </w:pPr>
+      <w:r>
+        <w:rPr>
+          <w:rFonts w:ascii="Times New Roman" w:hAnsi="Times New Roman" w:cs="Times New Roman"/>
+          <w:noProof/>
+          <w:sz w:val="36"/>
+          <w:szCs w:val="36"/>
+        </w:rPr>
+        <w:lastRenderedPageBreak/>
+        <w:drawing>
+          <wp:anchor distT="0" distB="0" distL="114300" distR="114300" simplePos="0" relativeHeight="251667456" behindDoc="0" locked="0" layoutInCell="1" allowOverlap="1" wp14:anchorId="46B452A3" wp14:editId="32DEE463">
+            <wp:simplePos x="0" y="0"/>
+            <wp:positionH relativeFrom="margin">
+              <wp:align>center</wp:align>
+            </wp:positionH>
+            <wp:positionV relativeFrom="paragraph">
+              <wp:posOffset>456565</wp:posOffset>
+            </wp:positionV>
+            <wp:extent cx="1400175" cy="1471930"/>
+            <wp:effectExtent l="0" t="0" r="9525" b="0"/>
+            <wp:wrapTopAndBottom/>
+            <wp:docPr id="10" name="Kép 10"/>
+            <wp:cNvGraphicFramePr>
+              <a:graphicFrameLocks xmlns:a="http://schemas.openxmlformats.org/drawingml/2006/main" noChangeAspect="1"/>
+            </wp:cNvGraphicFramePr>
+            <a:graphic xmlns:a="http://schemas.openxmlformats.org/drawingml/2006/main">
+              <a:graphicData uri="http://schemas.openxmlformats.org/drawingml/2006/picture">
+                <pic:pic xmlns:pic="http://schemas.openxmlformats.org/drawingml/2006/picture">
+                  <pic:nvPicPr>
+                    <pic:cNvPr id="10" name="success.png"/>
+                    <pic:cNvPicPr/>
+                  </pic:nvPicPr>
+                  <pic:blipFill>
+                    <a:blip r:embed="rId8">
+                      <a:extLst>
+                        <a:ext uri="{28A0092B-C50C-407E-A947-70E740481C1C}">
+                          <a14:useLocalDpi xmlns:a14="http://schemas.microsoft.com/office/drawing/2010/main" val="0"/>
+                        </a:ext>
+                      </a:extLst>
+                    </a:blip>
+                    <a:stretch>
+                      <a:fillRect/>
+                    </a:stretch>
+                  </pic:blipFill>
+                  <pic:spPr>
+                    <a:xfrm>
+                      <a:off x="0" y="0"/>
+                      <a:ext cx="1400175" cy="1471930"/>
+                    </a:xfrm>
+                    <a:prstGeom prst="rect">
+                      <a:avLst/>
+                    </a:prstGeom>
+                  </pic:spPr>
+                </pic:pic>
+              </a:graphicData>
+            </a:graphic>
+            <wp14:sizeRelH relativeFrom="margin">
+              <wp14:pctWidth>0</wp14:pctWidth>
+            </wp14:sizeRelH>
+            <wp14:sizeRelV relativeFrom="margin">
+              <wp14:pctHeight>0</wp14:pctHeight>
+            </wp14:sizeRelV>
+          </wp:anchor>
+        </w:drawing>
+      </w:r>
+      <w:r>
+        <w:rPr>
+          <w:rFonts w:ascii="Times New Roman" w:hAnsi="Times New Roman" w:cs="Times New Roman"/>
+          <w:sz w:val="36"/>
+          <w:szCs w:val="36"/>
+        </w:rPr>
+        <w:t xml:space="preserve">4. </w:t>
+      </w:r>
+      <w:r>
+        <w:rPr>
+          <w:rFonts w:ascii="Times New Roman" w:hAnsi="Times New Roman" w:cs="Times New Roman"/>
+          <w:sz w:val="36"/>
+          <w:szCs w:val="36"/>
+        </w:rPr>
+        <w:t>-</w:t>
+      </w:r>
+      <w:r>
+        <w:rPr>
+          <w:rFonts w:ascii="Times New Roman" w:hAnsi="Times New Roman" w:cs="Times New Roman"/>
+          <w:sz w:val="36"/>
+          <w:szCs w:val="36"/>
+        </w:rPr>
+        <w:t xml:space="preserve"> Az adatsor törlése</w:t>
+      </w:r>
+      <w:r>
+        <w:rPr>
+          <w:rFonts w:ascii="Times New Roman" w:hAnsi="Times New Roman" w:cs="Times New Roman"/>
+          <w:sz w:val="36"/>
+          <w:szCs w:val="36"/>
+        </w:rPr>
+        <w:t>,</w:t>
+      </w:r>
+      <w:r>
+        <w:rPr>
+          <w:rFonts w:ascii="Times New Roman" w:hAnsi="Times New Roman" w:cs="Times New Roman"/>
+          <w:sz w:val="36"/>
+          <w:szCs w:val="36"/>
+        </w:rPr>
+        <w:t xml:space="preserve"> után</w:t>
+      </w:r>
+      <w:r>
+        <w:rPr>
+          <w:rFonts w:ascii="Times New Roman" w:hAnsi="Times New Roman" w:cs="Times New Roman"/>
+          <w:sz w:val="36"/>
+          <w:szCs w:val="36"/>
+        </w:rPr>
+        <w:t>a</w:t>
+      </w:r>
+      <w:r>
+        <w:rPr>
+          <w:rFonts w:ascii="Times New Roman" w:hAnsi="Times New Roman" w:cs="Times New Roman"/>
+          <w:sz w:val="36"/>
+          <w:szCs w:val="36"/>
+        </w:rPr>
+        <w:t xml:space="preserve"> a lista </w:t>
+      </w:r>
+      <w:r>
+        <w:rPr>
+          <w:rFonts w:ascii="Times New Roman" w:hAnsi="Times New Roman" w:cs="Times New Roman"/>
+          <w:sz w:val="36"/>
+          <w:szCs w:val="36"/>
+        </w:rPr>
+        <w:t>frissülése a datagridben</w:t>
+      </w:r>
+      <w:r>
+        <w:rPr>
+          <w:rFonts w:ascii="Times New Roman" w:hAnsi="Times New Roman" w:cs="Times New Roman"/>
+          <w:sz w:val="36"/>
+          <w:szCs w:val="36"/>
+        </w:rPr>
+        <w:t>.</w:t>
+      </w:r>
+    </w:p>
+    <w:p>
+      <w:pPr>
+        <w:rPr>
+          <w:rFonts w:ascii="Times New Roman" w:hAnsi="Times New Roman" w:cs="Times New Roman"/>
+          <w:sz w:val="36"/>
+          <w:szCs w:val="36"/>
+        </w:rPr>
+      </w:pPr>
+      <w:r>
+        <w:rPr>
+          <w:rFonts w:ascii="Times New Roman" w:hAnsi="Times New Roman" w:cs="Times New Roman"/>
+          <w:noProof/>
+          <w:sz w:val="36"/>
+          <w:szCs w:val="36"/>
+        </w:rPr>
+        <w:drawing>
+          <wp:anchor distT="0" distB="0" distL="114300" distR="114300" simplePos="0" relativeHeight="251668480" behindDoc="0" locked="0" layoutInCell="1" allowOverlap="1" wp14:anchorId="626713E4" wp14:editId="2B27E0CC">
+            <wp:simplePos x="0" y="0"/>
+            <wp:positionH relativeFrom="margin">
+              <wp:align>center</wp:align>
+            </wp:positionH>
+            <wp:positionV relativeFrom="paragraph">
+              <wp:posOffset>1697990</wp:posOffset>
+            </wp:positionV>
+            <wp:extent cx="5895340" cy="5838825"/>
+            <wp:effectExtent l="0" t="0" r="0" b="9525"/>
+            <wp:wrapTopAndBottom/>
+            <wp:docPr id="11" name="Kép 11"/>
+            <wp:cNvGraphicFramePr>
+              <a:graphicFrameLocks xmlns:a="http://schemas.openxmlformats.org/drawingml/2006/main" noChangeAspect="1"/>
+            </wp:cNvGraphicFramePr>
+            <a:graphic xmlns:a="http://schemas.openxmlformats.org/drawingml/2006/main">
+              <a:graphicData uri="http://schemas.openxmlformats.org/drawingml/2006/picture">
+                <pic:pic xmlns:pic="http://schemas.openxmlformats.org/drawingml/2006/picture">
+                  <pic:nvPicPr>
+                    <pic:cNvPr id="11" name="filmek5.png"/>
+                    <pic:cNvPicPr/>
+                  </pic:nvPicPr>
+                  <pic:blipFill>
+                    <a:blip r:embed="rId10">
+                      <a:extLst>
+                        <a:ext uri="{28A0092B-C50C-407E-A947-70E740481C1C}">
+                          <a14:useLocalDpi xmlns:a14="http://schemas.microsoft.com/office/drawing/2010/main" val="0"/>
+                        </a:ext>
+                      </a:extLst>
+                    </a:blip>
+                    <a:stretch>
+                      <a:fillRect/>
+                    </a:stretch>
+                  </pic:blipFill>
+                  <pic:spPr>
+                    <a:xfrm>
+                      <a:off x="0" y="0"/>
+                      <a:ext cx="5895340" cy="5838825"/>
+                    </a:xfrm>
+                    <a:prstGeom prst="rect">
+                      <a:avLst/>
+                    </a:prstGeom>
+                  </pic:spPr>
+                </pic:pic>
+              </a:graphicData>
+            </a:graphic>
+            <wp14:sizeRelH relativeFrom="margin">
+              <wp14:pctWidth>0</wp14:pctWidth>
+            </wp14:sizeRelH>
+            <wp14:sizeRelV relativeFrom="margin">
+              <wp14:pctHeight>0</wp14:pctHeight>
+            </wp14:sizeRelV>
+          </wp:anchor>
+        </w:drawing>
+      </w:r>
+      <w:r>
+        <w:rPr>
+          <w:rFonts w:ascii="Times New Roman" w:hAnsi="Times New Roman" w:cs="Times New Roman"/>
+          <w:sz w:val="36"/>
+          <w:szCs w:val="36"/>
+        </w:rPr>
+        <w:br w:type="page"/>
+      </w:r>
+    </w:p>
+    <w:p>
+      <w:pPr>
+        <w:spacing w:beforeAutospacing="1" w:after="100" w:afterAutospacing="1" w:line="240" w:lineRule="auto"/>
+        <w:rPr>
+          <w:rFonts w:ascii="Times New Roman" w:eastAsia="Times New Roman" w:hAnsi="Times New Roman" w:cs="Times New Roman"/>
+          <w:bCs/>
+          <w:sz w:val="36"/>
+          <w:szCs w:val="36"/>
+          <w:lang w:eastAsia="hu-HU"/>
+        </w:rPr>
+      </w:pPr>
+      <w:r>
+        <w:rPr>
+          <w:rFonts w:ascii="Times New Roman" w:eastAsia="Times New Roman" w:hAnsi="Times New Roman" w:cs="Times New Roman"/>
+          <w:noProof/>
+          <w:sz w:val="36"/>
+          <w:szCs w:val="36"/>
+          <w:lang w:eastAsia="hu-HU"/>
+        </w:rPr>
+        <w:lastRenderedPageBreak/>
+        <w:drawing>
+          <wp:anchor distT="0" distB="0" distL="114300" distR="114300" simplePos="0" relativeHeight="251669504" behindDoc="0" locked="0" layoutInCell="1" allowOverlap="1" wp14:anchorId="20256B86" wp14:editId="6CA4D25A">
+            <wp:simplePos x="0" y="0"/>
+            <wp:positionH relativeFrom="margin">
+              <wp:align>center</wp:align>
+            </wp:positionH>
+            <wp:positionV relativeFrom="paragraph">
+              <wp:posOffset>2262505</wp:posOffset>
+            </wp:positionV>
+            <wp:extent cx="6235700" cy="3966845"/>
+            <wp:effectExtent l="0" t="0" r="0" b="0"/>
+            <wp:wrapTopAndBottom/>
+            <wp:docPr id="12" name="Kép 12"/>
+            <wp:cNvGraphicFramePr>
+              <a:graphicFrameLocks xmlns:a="http://schemas.openxmlformats.org/drawingml/2006/main" noChangeAspect="1"/>
+            </wp:cNvGraphicFramePr>
+            <a:graphic xmlns:a="http://schemas.openxmlformats.org/drawingml/2006/main">
+              <a:graphicData uri="http://schemas.openxmlformats.org/drawingml/2006/picture">
+                <pic:pic xmlns:pic="http://schemas.openxmlformats.org/drawingml/2006/picture">
+                  <pic:nvPicPr>
+                    <pic:cNvPr id="12" name="filmek4.png"/>
+                    <pic:cNvPicPr/>
+                  </pic:nvPicPr>
+                  <pic:blipFill>
+                    <a:blip r:embed="rId11">
+                      <a:extLst>
+                        <a:ext uri="{28A0092B-C50C-407E-A947-70E740481C1C}">
+                          <a14:useLocalDpi xmlns:a14="http://schemas.microsoft.com/office/drawing/2010/main" val="0"/>
+                        </a:ext>
+                      </a:extLst>
+                    </a:blip>
+                    <a:stretch>
+                      <a:fillRect/>
+                    </a:stretch>
+                  </pic:blipFill>
+                  <pic:spPr>
+                    <a:xfrm>
+                      <a:off x="0" y="0"/>
+                      <a:ext cx="6235700" cy="3966845"/>
+                    </a:xfrm>
+                    <a:prstGeom prst="rect">
+                      <a:avLst/>
+                    </a:prstGeom>
+                  </pic:spPr>
+                </pic:pic>
+              </a:graphicData>
+            </a:graphic>
+            <wp14:sizeRelH relativeFrom="margin">
+              <wp14:pctWidth>0</wp14:pctWidth>
+            </wp14:sizeRelH>
+            <wp14:sizeRelV relativeFrom="margin">
+              <wp14:pctHeight>0</wp14:pctHeight>
+            </wp14:sizeRelV>
+          </wp:anchor>
+        </w:drawing>
+      </w:r>
+      <w:r>
+        <w:rPr>
+          <w:rFonts w:ascii="Times New Roman" w:eastAsia="Times New Roman" w:hAnsi="Times New Roman" w:cs="Times New Roman"/>
+          <w:noProof/>
+          <w:sz w:val="36"/>
+          <w:szCs w:val="36"/>
+          <w:lang w:eastAsia="hu-HU"/>
+        </w:rPr>
+        <w:drawing>
+          <wp:anchor distT="0" distB="0" distL="114300" distR="114300" simplePos="0" relativeHeight="251670528" behindDoc="0" locked="0" layoutInCell="1" allowOverlap="1" wp14:anchorId="06BA8B0C" wp14:editId="186EBE43">
+            <wp:simplePos x="0" y="0"/>
+            <wp:positionH relativeFrom="margin">
+              <wp:align>center</wp:align>
+            </wp:positionH>
+            <wp:positionV relativeFrom="paragraph">
+              <wp:posOffset>617855</wp:posOffset>
+            </wp:positionV>
+            <wp:extent cx="1409700" cy="1482090"/>
+            <wp:effectExtent l="0" t="0" r="0" b="3810"/>
+            <wp:wrapTopAndBottom/>
+            <wp:docPr id="13" name="Kép 13"/>
+            <wp:cNvGraphicFramePr>
+              <a:graphicFrameLocks xmlns:a="http://schemas.openxmlformats.org/drawingml/2006/main" noChangeAspect="1"/>
+            </wp:cNvGraphicFramePr>
+            <a:graphic xmlns:a="http://schemas.openxmlformats.org/drawingml/2006/main">
+              <a:graphicData uri="http://schemas.openxmlformats.org/drawingml/2006/picture">
+                <pic:pic xmlns:pic="http://schemas.openxmlformats.org/drawingml/2006/picture">
+                  <pic:nvPicPr>
+                    <pic:cNvPr id="13" name="success.png"/>
+                    <pic:cNvPicPr/>
+                  </pic:nvPicPr>
+                  <pic:blipFill>
+                    <a:blip r:embed="rId8">
+                      <a:extLst>
+                        <a:ext uri="{28A0092B-C50C-407E-A947-70E740481C1C}">
+                          <a14:useLocalDpi xmlns:a14="http://schemas.microsoft.com/office/drawing/2010/main" val="0"/>
+                        </a:ext>
+                      </a:extLst>
+                    </a:blip>
+                    <a:stretch>
+                      <a:fillRect/>
+                    </a:stretch>
+                  </pic:blipFill>
+                  <pic:spPr>
+                    <a:xfrm>
+                      <a:off x="0" y="0"/>
+                      <a:ext cx="1409700" cy="1482090"/>
+                    </a:xfrm>
+                    <a:prstGeom prst="rect">
+                      <a:avLst/>
+                    </a:prstGeom>
+                  </pic:spPr>
+                </pic:pic>
+              </a:graphicData>
+            </a:graphic>
+            <wp14:sizeRelH relativeFrom="margin">
+              <wp14:pctWidth>0</wp14:pctWidth>
+            </wp14:sizeRelH>
+            <wp14:sizeRelV relativeFrom="margin">
+              <wp14:pctHeight>0</wp14:pctHeight>
+            </wp14:sizeRelV>
+          </wp:anchor>
+        </w:drawing>
+      </w:r>
+      <w:r>
+        <w:rPr>
+          <w:rFonts w:ascii="Times New Roman" w:eastAsia="Times New Roman" w:hAnsi="Times New Roman" w:cs="Times New Roman"/>
+          <w:bCs/>
+          <w:sz w:val="36"/>
+          <w:szCs w:val="36"/>
+          <w:lang w:eastAsia="hu-HU"/>
+        </w:rPr>
+        <w:t>5. - Az adatok módosítása</w:t>
+      </w:r>
+      <w:r>
+        <w:rPr>
+          <w:rFonts w:ascii="Times New Roman" w:eastAsia="Times New Roman" w:hAnsi="Times New Roman" w:cs="Times New Roman"/>
+          <w:bCs/>
+          <w:sz w:val="36"/>
+          <w:szCs w:val="36"/>
+          <w:lang w:eastAsia="hu-HU"/>
+        </w:rPr>
+        <w:t>,</w:t>
+      </w:r>
+      <w:r>
+        <w:rPr>
+          <w:rFonts w:ascii="Times New Roman" w:eastAsia="Times New Roman" w:hAnsi="Times New Roman" w:cs="Times New Roman"/>
+          <w:bCs/>
+          <w:sz w:val="36"/>
+          <w:szCs w:val="36"/>
+          <w:lang w:eastAsia="hu-HU"/>
+        </w:rPr>
+        <w:t xml:space="preserve"> után</w:t>
+      </w:r>
+      <w:r>
+        <w:rPr>
+          <w:rFonts w:ascii="Times New Roman" w:eastAsia="Times New Roman" w:hAnsi="Times New Roman" w:cs="Times New Roman"/>
+          <w:bCs/>
+          <w:sz w:val="36"/>
+          <w:szCs w:val="36"/>
+          <w:lang w:eastAsia="hu-HU"/>
+        </w:rPr>
+        <w:t>a</w:t>
+      </w:r>
+      <w:r>
+        <w:rPr>
+          <w:rFonts w:ascii="Times New Roman" w:eastAsia="Times New Roman" w:hAnsi="Times New Roman" w:cs="Times New Roman"/>
+          <w:bCs/>
+          <w:sz w:val="36"/>
+          <w:szCs w:val="36"/>
+          <w:lang w:eastAsia="hu-HU"/>
+        </w:rPr>
+        <w:t xml:space="preserve"> a frissített értékek megjelenése.</w:t>
+      </w:r>
+    </w:p>
+    <w:p>
+      <w:pPr>
+        <w:rPr>
+          <w:rFonts w:ascii="Times New Roman" w:eastAsia="Times New Roman" w:hAnsi="Times New Roman" w:cs="Times New Roman"/>
+          <w:bCs/>
+          <w:sz w:val="36"/>
+          <w:szCs w:val="36"/>
+          <w:lang w:eastAsia="hu-HU"/>
+        </w:rPr>
+      </w:pPr>
+      <w:r>
+        <w:rPr>
+          <w:rFonts w:ascii="Times New Roman" w:eastAsia="Times New Roman" w:hAnsi="Times New Roman" w:cs="Times New Roman"/>
+          <w:bCs/>
+          <w:sz w:val="36"/>
+          <w:szCs w:val="36"/>
+          <w:lang w:eastAsia="hu-HU"/>
+        </w:rPr>
+        <w:br w:type="page"/>
+      </w:r>
+    </w:p>
+    <w:p>
+      <w:pPr>
+        <w:spacing w:after="100" w:afterAutospacing="1" w:line="240" w:lineRule="auto"/>
+        <w:jc w:val="both"/>
+        <w:rPr>
+          <w:rFonts w:ascii="Times New Roman" w:hAnsi="Times New Roman" w:cs="Times New Roman"/>
+          <w:sz w:val="36"/>
+          <w:szCs w:val="36"/>
+        </w:rPr>
+      </w:pPr>
+      <w:r>
+        <w:rPr>
+          <w:rFonts w:ascii="Times New Roman" w:eastAsia="Times New Roman" w:hAnsi="Times New Roman" w:cs="Times New Roman"/>
+          <w:noProof/>
+          <w:sz w:val="36"/>
+          <w:szCs w:val="36"/>
+          <w:lang w:eastAsia="hu-HU"/>
+        </w:rPr>
+        <w:lastRenderedPageBreak/>
+        <w:drawing>
+          <wp:anchor distT="0" distB="0" distL="114300" distR="114300" simplePos="0" relativeHeight="251663360" behindDoc="0" locked="0" layoutInCell="1" allowOverlap="1" wp14:anchorId="2C8267E2" wp14:editId="50E5FDC7">
+            <wp:simplePos x="0" y="0"/>
+            <wp:positionH relativeFrom="margin">
+              <wp:align>right</wp:align>
+            </wp:positionH>
+            <wp:positionV relativeFrom="paragraph">
+              <wp:posOffset>752475</wp:posOffset>
+            </wp:positionV>
+            <wp:extent cx="5760720" cy="4843145"/>
+            <wp:effectExtent l="0" t="0" r="0" b="0"/>
+            <wp:wrapSquare wrapText="bothSides"/>
+            <wp:docPr id="6" name="Kép 6"/>
+            <wp:cNvGraphicFramePr>
+              <a:graphicFrameLocks xmlns:a="http://schemas.openxmlformats.org/drawingml/2006/main" noChangeAspect="1"/>
+            </wp:cNvGraphicFramePr>
+            <a:graphic xmlns:a="http://schemas.openxmlformats.org/drawingml/2006/main">
+              <a:graphicData uri="http://schemas.openxmlformats.org/drawingml/2006/picture">
+                <pic:pic xmlns:pic="http://schemas.openxmlformats.org/drawingml/2006/picture">
+                  <pic:nvPicPr>
+                    <pic:cNvPr id="6" name="hiba.png"/>
+                    <pic:cNvPicPr/>
+                  </pic:nvPicPr>
+                  <pic:blipFill>
+                    <a:blip r:embed="rId12">
+                      <a:extLst>
+                        <a:ext uri="{28A0092B-C50C-407E-A947-70E740481C1C}">
+                          <a14:useLocalDpi xmlns:a14="http://schemas.microsoft.com/office/drawing/2010/main" val="0"/>
+                        </a:ext>
+                      </a:extLst>
+                    </a:blip>
+                    <a:stretch>
+                      <a:fillRect/>
+                    </a:stretch>
+                  </pic:blipFill>
+                  <pic:spPr>
+                    <a:xfrm>
+                      <a:off x="0" y="0"/>
+                      <a:ext cx="5760720" cy="4843145"/>
+                    </a:xfrm>
+                    <a:prstGeom prst="rect">
+                      <a:avLst/>
+                    </a:prstGeom>
+                  </pic:spPr>
+                </pic:pic>
+              </a:graphicData>
+            </a:graphic>
+          </wp:anchor>
+        </w:drawing>
+      </w:r>
+      <w:r>
+        <w:rPr>
+          <w:rFonts w:ascii="Times New Roman" w:hAnsi="Times New Roman" w:cs="Times New Roman"/>
+          <w:sz w:val="36"/>
+          <w:szCs w:val="36"/>
+        </w:rPr>
+        <w:t>H1,</w:t>
+      </w:r>
+      <w:r>
+        <w:rPr>
+          <w:rFonts w:ascii="Times New Roman" w:hAnsi="Times New Roman" w:cs="Times New Roman"/>
+          <w:sz w:val="36"/>
+          <w:szCs w:val="36"/>
+        </w:rPr>
+        <w:t xml:space="preserve"> </w:t>
+      </w:r>
+      <w:r>
+        <w:rPr>
+          <w:rFonts w:ascii="Times New Roman" w:hAnsi="Times New Roman" w:cs="Times New Roman"/>
+          <w:sz w:val="36"/>
+          <w:szCs w:val="36"/>
+        </w:rPr>
+        <w:t>H2</w:t>
+      </w:r>
+      <w:r>
+        <w:rPr>
+          <w:rFonts w:ascii="Times New Roman" w:hAnsi="Times New Roman" w:cs="Times New Roman"/>
+          <w:sz w:val="36"/>
+          <w:szCs w:val="36"/>
+        </w:rPr>
+        <w:t xml:space="preserve"> </w:t>
+      </w:r>
+      <w:r>
+        <w:rPr>
+          <w:rFonts w:ascii="Times New Roman" w:hAnsi="Times New Roman" w:cs="Times New Roman"/>
+          <w:sz w:val="36"/>
+          <w:szCs w:val="36"/>
+        </w:rPr>
+        <w:t>–</w:t>
+      </w:r>
+      <w:r>
+        <w:rPr>
+          <w:rFonts w:ascii="Times New Roman" w:hAnsi="Times New Roman" w:cs="Times New Roman"/>
+          <w:sz w:val="36"/>
+          <w:szCs w:val="36"/>
+        </w:rPr>
+        <w:t xml:space="preserve"> </w:t>
+      </w:r>
+      <w:r>
+        <w:rPr>
+          <w:rFonts w:ascii="Times New Roman" w:hAnsi="Times New Roman" w:cs="Times New Roman"/>
+          <w:sz w:val="36"/>
+          <w:szCs w:val="36"/>
+        </w:rPr>
+        <w:t>Nem találja trailer</w:t>
+      </w:r>
+      <w:r>
+        <w:rPr>
+          <w:rFonts w:ascii="Times New Roman" w:hAnsi="Times New Roman" w:cs="Times New Roman"/>
+          <w:sz w:val="36"/>
+          <w:szCs w:val="36"/>
+        </w:rPr>
+        <w:t xml:space="preserve"> mezőt az adatbázisban így nem tudja feltölteni a trailer inputot</w:t>
+      </w:r>
+      <w:r>
+        <w:rPr>
+          <w:rFonts w:ascii="Times New Roman" w:hAnsi="Times New Roman" w:cs="Times New Roman"/>
+          <w:sz w:val="36"/>
+          <w:szCs w:val="36"/>
+        </w:rPr>
+        <w:t>.</w:t>
+      </w:r>
     </w:p>
     <w:sectPr>
       <w:pgSz w:w="11906" w:h="16838"/>
@@ -294,6 +1839,163 @@
     </w:sectPr>
   </w:body>
 </w:document>
+</file>
+
+<file path=word/numbering.xml><?xml version="1.0" encoding="utf-8"?>
+<w:numbering xmlns:wpc="http://schemas.microsoft.com/office/word/2010/wordprocessingCanvas" xmlns:cx="http://schemas.microsoft.com/office/drawing/2014/chartex" xmlns:cx1="http://schemas.microsoft.com/office/drawing/2015/9/8/chartex" xmlns:cx2="http://schemas.microsoft.com/office/drawing/2015/10/21/chartex" xmlns:cx3="http://schemas.microsoft.com/office/drawing/2016/5/9/chartex" xmlns:cx4="http://schemas.microsoft.com/office/drawing/2016/5/10/chartex" xmlns:cx5="http://schemas.microsoft.com/office/drawing/2016/5/11/chartex" xmlns:cx6="http://schemas.microsoft.com/office/drawing/2016/5/12/chartex" xmlns:cx7="http://schemas.microsoft.com/office/drawing/2016/5/13/chartex" xmlns:cx8="http://schemas.microsoft.com/office/drawing/2016/5/14/chartex" xmlns:mc="http://schemas.openxmlformats.org/markup-compatibility/2006" xmlns:aink="http://schemas.microsoft.com/office/drawing/2016/ink" xmlns:am3d="http://schemas.microsoft.com/office/drawing/2017/model3d" xmlns:o="urn:schemas-microsoft-com:office:office" xmlns:r="http://schemas.openxmlformats.org/officeDocument/2006/relationships" xmlns:m="http://schemas.openxmlformats.org/officeDocument/2006/math" xmlns:v="urn:schemas-microsoft-com:vml" xmlns:wp14="http://schemas.microsoft.com/office/word/2010/wordprocessingDrawing" xmlns:wp="http://schemas.openxmlformats.org/drawingml/2006/wordprocessingDrawing" xmlns:w10="urn:schemas-microsoft-com:office:word" xmlns:w="http://schemas.openxmlformats.org/wordprocessingml/2006/main" xmlns:w14="http://schemas.microsoft.com/office/word/2010/wordml" xmlns:w15="http://schemas.microsoft.com/office/word/2012/wordml" xmlns:w16cid="http://schemas.microsoft.com/office/word/2016/wordml/cid" xmlns:w16se="http://schemas.microsoft.com/office/word/2015/wordml/symex" xmlns:wpg="http://schemas.microsoft.com/office/word/2010/wordprocessingGroup" xmlns:wpi="http://schemas.microsoft.com/office/word/2010/wordprocessingInk" xmlns:wne="http://schemas.microsoft.com/office/word/2006/wordml" xmlns:wps="http://schemas.microsoft.com/office/word/2010/wordprocessingShape" mc:Ignorable="w14 w15 w16se w16cid wp14">
+  <w:abstractNum w:abstractNumId="0" w15:restartNumberingAfterBreak="0">
+    <w:nsid w:val="558D458B"/>
+    <w:multiLevelType w:val="multilevel"/>
+    <w:tmpl w:val="570CCED4"/>
+    <w:lvl w:ilvl="0">
+      <w:start w:val="1"/>
+      <w:numFmt w:val="bullet"/>
+      <w:lvlText w:val=""/>
+      <w:lvlJc w:val="left"/>
+      <w:pPr>
+        <w:tabs>
+          <w:tab w:val="num" w:pos="720"/>
+        </w:tabs>
+        <w:ind w:left="720" w:hanging="360"/>
+      </w:pPr>
+      <w:rPr>
+        <w:rFonts w:ascii="Symbol" w:hAnsi="Symbol" w:hint="default"/>
+        <w:sz w:val="20"/>
+      </w:rPr>
+    </w:lvl>
+    <w:lvl w:ilvl="1" w:tentative="1">
+      <w:start w:val="1"/>
+      <w:numFmt w:val="bullet"/>
+      <w:lvlText w:val="o"/>
+      <w:lvlJc w:val="left"/>
+      <w:pPr>
+        <w:tabs>
+          <w:tab w:val="num" w:pos="1440"/>
+        </w:tabs>
+        <w:ind w:left="1440" w:hanging="360"/>
+      </w:pPr>
+      <w:rPr>
+        <w:rFonts w:ascii="Courier New" w:hAnsi="Courier New" w:hint="default"/>
+        <w:sz w:val="20"/>
+      </w:rPr>
+    </w:lvl>
+    <w:lvl w:ilvl="2" w:tentative="1">
+      <w:start w:val="1"/>
+      <w:numFmt w:val="bullet"/>
+      <w:lvlText w:val=""/>
+      <w:lvlJc w:val="left"/>
+      <w:pPr>
+        <w:tabs>
+          <w:tab w:val="num" w:pos="2160"/>
+        </w:tabs>
+        <w:ind w:left="2160" w:hanging="360"/>
+      </w:pPr>
+      <w:rPr>
+        <w:rFonts w:ascii="Wingdings" w:hAnsi="Wingdings" w:hint="default"/>
+        <w:sz w:val="20"/>
+      </w:rPr>
+    </w:lvl>
+    <w:lvl w:ilvl="3" w:tentative="1">
+      <w:start w:val="1"/>
+      <w:numFmt w:val="bullet"/>
+      <w:lvlText w:val=""/>
+      <w:lvlJc w:val="left"/>
+      <w:pPr>
+        <w:tabs>
+          <w:tab w:val="num" w:pos="2880"/>
+        </w:tabs>
+        <w:ind w:left="2880" w:hanging="360"/>
+      </w:pPr>
+      <w:rPr>
+        <w:rFonts w:ascii="Wingdings" w:hAnsi="Wingdings" w:hint="default"/>
+        <w:sz w:val="20"/>
+      </w:rPr>
+    </w:lvl>
+    <w:lvl w:ilvl="4" w:tentative="1">
+      <w:start w:val="1"/>
+      <w:numFmt w:val="bullet"/>
+      <w:lvlText w:val=""/>
+      <w:lvlJc w:val="left"/>
+      <w:pPr>
+        <w:tabs>
+          <w:tab w:val="num" w:pos="3600"/>
+        </w:tabs>
+        <w:ind w:left="3600" w:hanging="360"/>
+      </w:pPr>
+      <w:rPr>
+        <w:rFonts w:ascii="Wingdings" w:hAnsi="Wingdings" w:hint="default"/>
+        <w:sz w:val="20"/>
+      </w:rPr>
+    </w:lvl>
+    <w:lvl w:ilvl="5" w:tentative="1">
+      <w:start w:val="1"/>
+      <w:numFmt w:val="bullet"/>
+      <w:lvlText w:val=""/>
+      <w:lvlJc w:val="left"/>
+      <w:pPr>
+        <w:tabs>
+          <w:tab w:val="num" w:pos="4320"/>
+        </w:tabs>
+        <w:ind w:left="4320" w:hanging="360"/>
+      </w:pPr>
+      <w:rPr>
+        <w:rFonts w:ascii="Wingdings" w:hAnsi="Wingdings" w:hint="default"/>
+        <w:sz w:val="20"/>
+      </w:rPr>
+    </w:lvl>
+    <w:lvl w:ilvl="6" w:tentative="1">
+      <w:start w:val="1"/>
+      <w:numFmt w:val="bullet"/>
+      <w:lvlText w:val=""/>
+      <w:lvlJc w:val="left"/>
+      <w:pPr>
+        <w:tabs>
+          <w:tab w:val="num" w:pos="5040"/>
+        </w:tabs>
+        <w:ind w:left="5040" w:hanging="360"/>
+      </w:pPr>
+      <w:rPr>
+        <w:rFonts w:ascii="Wingdings" w:hAnsi="Wingdings" w:hint="default"/>
+        <w:sz w:val="20"/>
+      </w:rPr>
+    </w:lvl>
+    <w:lvl w:ilvl="7" w:tentative="1">
+      <w:start w:val="1"/>
+      <w:numFmt w:val="bullet"/>
+      <w:lvlText w:val=""/>
+      <w:lvlJc w:val="left"/>
+      <w:pPr>
+        <w:tabs>
+          <w:tab w:val="num" w:pos="5760"/>
+        </w:tabs>
+        <w:ind w:left="5760" w:hanging="360"/>
+      </w:pPr>
+      <w:rPr>
+        <w:rFonts w:ascii="Wingdings" w:hAnsi="Wingdings" w:hint="default"/>
+        <w:sz w:val="20"/>
+      </w:rPr>
+    </w:lvl>
+    <w:lvl w:ilvl="8" w:tentative="1">
+      <w:start w:val="1"/>
+      <w:numFmt w:val="bullet"/>
+      <w:lvlText w:val=""/>
+      <w:lvlJc w:val="left"/>
+      <w:pPr>
+        <w:tabs>
+          <w:tab w:val="num" w:pos="6480"/>
+        </w:tabs>
+        <w:ind w:left="6480" w:hanging="360"/>
+      </w:pPr>
+      <w:rPr>
+        <w:rFonts w:ascii="Wingdings" w:hAnsi="Wingdings" w:hint="default"/>
+        <w:sz w:val="20"/>
+      </w:rPr>
+    </w:lvl>
+  </w:abstractNum>
+  <w:num w:numId="1">
+    <w:abstractNumId w:val="0"/>
+  </w:num>
+</w:numbering>
 </file>
 
 <file path=word/styles.xml><?xml version="1.0" encoding="utf-8"?>

</xml_diff>